<commit_message>
Document Codex desktop setup with verified Windows paths
</commit_message>
<xml_diff>
--- a/docs/Windows安装操作手册.docx
+++ b/docs/Windows安装操作手册.docx
@@ -2,7 +2,7 @@
 <file path=word/document.xml><?xml version="1.0" encoding="utf-8"?>
 <w:document xmlns:w="http://schemas.openxmlformats.org/wordprocessingml/2006/main" xmlns:m="http://schemas.openxmlformats.org/officeDocument/2006/math" xmlns:r="http://schemas.openxmlformats.org/officeDocument/2006/relationships" xmlns:o="urn:schemas-microsoft-com:office:office" xmlns:v="urn:schemas-microsoft-com:vml" xmlns:w10="urn:schemas-microsoft-com:office:word" xmlns:a="http://schemas.openxmlformats.org/drawingml/2006/main" xmlns:pic="http://schemas.openxmlformats.org/drawingml/2006/picture" xmlns:wp="http://schemas.openxmlformats.org/drawingml/2006/wordprocessingDrawing">
   <w:body>
-    <w:bookmarkStart w:id="32" w:name="pecvd-fluent-2024-r1-本地-mcp-接入包"/>
+    <w:bookmarkStart w:id="36" w:name="pecvd-fluent-2024-r1-本地-mcp-接入包"/>
     <w:p>
       <w:pPr>
         <w:pStyle w:val="Heading1"/>
@@ -11,7 +11,7 @@
         <w:t xml:space="preserve">PECVD Fluent 2024 R1 本地 MCP 接入包</w:t>
       </w:r>
     </w:p>
-    <w:bookmarkStart w:id="23" w:name="下载到电脑"/>
+    <w:bookmarkStart w:id="24" w:name="下载到电脑"/>
     <w:p>
       <w:pPr>
         <w:pStyle w:val="Heading2"/>
@@ -138,18 +138,50 @@
         <w:pStyle w:val="BodyText"/>
       </w:pPr>
       <w:r>
-        <w:t xml:space="preserve">适用你的环境：ANSYS 2024 R1 可以正常打开，尚未配置 MCP。版本 0.1.0，2026-10-28。</w:t>
-      </w:r>
-    </w:p>
-    <w:p>
-      <w:pPr>
-        <w:pStyle w:val="BodyText"/>
-      </w:pPr>
-      <w:r>
         <w:rPr>
           <w:b/>
           <w:bCs/>
         </w:rPr>
+        <w:t xml:space="preserve">已经完成安装和环境检测、准备使用 Codex 桌面版的用户，直接从第二节继续。</w:t>
+      </w:r>
+      <w:r>
+        <w:t xml:space="preserve"> </w:t>
+      </w:r>
+      <w:r>
+        <w:t xml:space="preserve">也可阅读</w:t>
+      </w:r>
+      <w:r>
+        <w:t xml:space="preserve"> </w:t>
+      </w:r>
+      <w:hyperlink r:id="rId23">
+        <w:r>
+          <w:rPr>
+            <w:rStyle w:val="Hyperlink"/>
+          </w:rPr>
+          <w:t xml:space="preserve">Codex 桌面版接入步骤</w:t>
+        </w:r>
+      </w:hyperlink>
+      <w:r>
+        <w:t xml:space="preserve">。已经安装成功时，无需为了修改客户端配置重新下载、解压或搬动工程。</w:t>
+      </w:r>
+    </w:p>
+    <w:p>
+      <w:pPr>
+        <w:pStyle w:val="BodyText"/>
+      </w:pPr>
+      <w:r>
+        <w:t xml:space="preserve">适用你的环境：ANSYS 2024 R1 可以正常打开，尚未配置 MCP。版本 0.1.0，2026-10-28。</w:t>
+      </w:r>
+    </w:p>
+    <w:p>
+      <w:pPr>
+        <w:pStyle w:val="BodyText"/>
+      </w:pPr>
+      <w:r>
+        <w:rPr>
+          <w:b/>
+          <w:bCs/>
+        </w:rPr>
         <w:t xml:space="preserve">本包是可运行的本地接入代码、简化网格与课题基准资料。当前交付尚未在你的电脑上运行 Fluent，也没有生成等离子体分布、沉积速率预测或图 4 的验证结果。</w:t>
       </w:r>
       <w:r>
@@ -159,8 +191,8 @@
         <w:t xml:space="preserve">本机安装并连接 MCP 客户端后，客户端中的助手才能调用你电脑上的求解器。本对话的云环境没有到你电脑的连接。</w:t>
       </w:r>
     </w:p>
-    <w:bookmarkEnd w:id="23"/>
-    <w:bookmarkStart w:id="25" w:name="一今天先完成连接"/>
+    <w:bookmarkEnd w:id="24"/>
+    <w:bookmarkStart w:id="26" w:name="一今天先完成连接"/>
     <w:p>
       <w:pPr>
         <w:pStyle w:val="Heading2"/>
@@ -207,7 +239,7 @@
       <w:r>
         <w:t xml:space="preserve"> </w:t>
       </w:r>
-      <w:hyperlink r:id="rId24">
+      <w:hyperlink r:id="rId25">
         <w:r>
           <w:rPr>
             <w:rStyle w:val="Hyperlink"/>
@@ -527,14 +559,14 @@
         <w:t xml:space="preserve">已不包含。不要把安装命令改成无版本限制的最新版。</w:t>
       </w:r>
     </w:p>
-    <w:bookmarkEnd w:id="25"/>
-    <w:bookmarkStart w:id="26" w:name="二选一个支持本地-mcp-的客户端"/>
+    <w:bookmarkEnd w:id="26"/>
+    <w:bookmarkStart w:id="30" w:name="二使用-codex-桌面版接入本地-mcp"/>
     <w:p>
       <w:pPr>
         <w:pStyle w:val="Heading2"/>
       </w:pPr>
       <w:r>
-        <w:t xml:space="preserve">二、选一个支持本地 MCP 的客户端</w:t>
+        <w:t xml:space="preserve">二、使用 Codex 桌面版接入本地 MCP</w:t>
       </w:r>
     </w:p>
     <w:p>
@@ -542,20 +574,70 @@
         <w:pStyle w:val="FirstParagraph"/>
       </w:pPr>
       <w:r>
-        <w:t xml:space="preserve">一个可选入口是</w:t>
-      </w:r>
-      <w:r>
-        <w:t xml:space="preserve"> </w:t>
+        <w:t xml:space="preserve">使用安装在 Fluent 所在 Windows 电脑上的 Codex 桌面版，并选择在该 Windows 环境运行的</w:t>
       </w:r>
       <w:r>
         <w:rPr>
           <w:b/>
           <w:bCs/>
         </w:rPr>
-        <w:t xml:space="preserve">Claude Desktop Windows 桌面版</w:t>
-      </w:r>
-      <w:r>
-        <w:t xml:space="preserve">。需自行安装并登录有权使用的客户端；账号权限和功能以其当前版本为准。本接入包不包含任何账号或订阅。</w:t>
+        <w:t xml:space="preserve">本地会话</w:t>
+      </w:r>
+      <w:r>
+        <w:t xml:space="preserve">。云端或 WSL/Linux 会话不能直接使用下面的 Windows Python 路径。当前聊天云环境不会因为你在电脑上启动 MCP 就自动得到本地工具。</w:t>
+      </w:r>
+    </w:p>
+    <w:bookmarkStart w:id="27" w:name="Xc89f33da8527b02ca7a2d5e2a8a71c3ec29cfb8"/>
+    <w:p>
+      <w:pPr>
+        <w:pStyle w:val="Heading3"/>
+      </w:pPr>
+      <w:r>
+        <w:t xml:space="preserve">2.1 修改 Codex 配置文件</w:t>
+      </w:r>
+    </w:p>
+    <w:p>
+      <w:pPr>
+        <w:pStyle w:val="FirstParagraph"/>
+      </w:pPr>
+      <w:r>
+        <w:t xml:space="preserve">打开默认的用户配置文件</w:t>
+      </w:r>
+      <w:r>
+        <w:t xml:space="preserve"> </w:t>
+      </w:r>
+      <w:r>
+        <w:rPr>
+          <w:rStyle w:val="VerbatimChar"/>
+        </w:rPr>
+        <w:t xml:space="preserve">%USERPROFILE%\.codex\config.toml</w:t>
+      </w:r>
+      <w:r>
+        <w:t xml:space="preserve">。可以在资源管理器地址栏输入</w:t>
+      </w:r>
+      <w:r>
+        <w:t xml:space="preserve"> </w:t>
+      </w:r>
+      <w:r>
+        <w:rPr>
+          <w:rStyle w:val="VerbatimChar"/>
+        </w:rPr>
+        <w:t xml:space="preserve">%USERPROFILE%\.codex</w:t>
+      </w:r>
+      <w:r>
+        <w:t xml:space="preserve">，用文本编辑器打开</w:t>
+      </w:r>
+      <w:r>
+        <w:t xml:space="preserve"> </w:t>
+      </w:r>
+      <w:r>
+        <w:rPr>
+          <w:rStyle w:val="VerbatimChar"/>
+        </w:rPr>
+        <w:t xml:space="preserve">config.toml</w:t>
+      </w:r>
+      <w:r>
+        <w:t xml:space="preserve">。若使用了自定义 Codex 配置目录，以 Codex 实际使用的配置文件为准。</w:t>
       </w:r>
     </w:p>
     <w:p>
@@ -563,7 +645,647 @@
         <w:pStyle w:val="BodyText"/>
       </w:pPr>
       <w:r>
-        <w:t xml:space="preserve">在支持本地 STDIO MCP 的客户端中添加服务：</w:t>
+        <w:t xml:space="preserve">保留其他配置；若文件已有</w:t>
+      </w:r>
+      <w:r>
+        <w:t xml:space="preserve"> </w:t>
+      </w:r>
+      <w:r>
+        <w:rPr>
+          <w:rStyle w:val="VerbatimChar"/>
+        </w:rPr>
+        <w:t xml:space="preserve">[mcp_servers.pecvd-fluent]</w:t>
+      </w:r>
+      <w:r>
+        <w:t xml:space="preserve"> </w:t>
+      </w:r>
+      <w:r>
+        <w:t xml:space="preserve">及其</w:t>
+      </w:r>
+      <w:r>
+        <w:t xml:space="preserve"> </w:t>
+      </w:r>
+      <w:r>
+        <w:rPr>
+          <w:rStyle w:val="VerbatimChar"/>
+        </w:rPr>
+        <w:t xml:space="preserve">.env</w:t>
+      </w:r>
+      <w:r>
+        <w:t xml:space="preserve">，替换这两个区块，避免重复定义。没有这两段时再在文件末尾追加。</w:t>
+      </w:r>
+    </w:p>
+    <w:p>
+      <w:pPr>
+        <w:pStyle w:val="BodyText"/>
+      </w:pPr>
+      <w:r>
+        <w:t xml:space="preserve">以下配置使用本次 Windows 检测截图中的真实工程目录。路径中的两个</w:t>
+      </w:r>
+      <w:r>
+        <w:t xml:space="preserve"> </w:t>
+      </w:r>
+      <w:r>
+        <w:rPr>
+          <w:rStyle w:val="VerbatimChar"/>
+        </w:rPr>
+        <w:t xml:space="preserve">pecvd-fluent-mcp-main</w:t>
+      </w:r>
+      <w:r>
+        <w:t xml:space="preserve"> </w:t>
+      </w:r>
+      <w:r>
+        <w:t xml:space="preserve">都要保留：</w:t>
+      </w:r>
+    </w:p>
+    <w:p>
+      <w:pPr>
+        <w:pStyle w:val="SourceCode"/>
+      </w:pPr>
+      <w:r>
+        <w:rPr>
+          <w:rStyle w:val="KeywordTok"/>
+        </w:rPr>
+        <w:t xml:space="preserve">[mcp_servers.pecvd-fluent]</w:t>
+      </w:r>
+      <w:r>
+        <w:br/>
+      </w:r>
+      <w:r>
+        <w:rPr>
+          <w:rStyle w:val="DataTypeTok"/>
+        </w:rPr>
+        <w:t xml:space="preserve">command</w:t>
+      </w:r>
+      <w:r>
+        <w:rPr>
+          <w:rStyle w:val="NormalTok"/>
+        </w:rPr>
+        <w:t xml:space="preserve"> </w:t>
+      </w:r>
+      <w:r>
+        <w:rPr>
+          <w:rStyle w:val="OperatorTok"/>
+        </w:rPr>
+        <w:t xml:space="preserve">=</w:t>
+      </w:r>
+      <w:r>
+        <w:rPr>
+          <w:rStyle w:val="NormalTok"/>
+        </w:rPr>
+        <w:t xml:space="preserve"> </w:t>
+      </w:r>
+      <w:r>
+        <w:rPr>
+          <w:rStyle w:val="StringTok"/>
+        </w:rPr>
+        <w:t xml:space="preserve">'</w:t>
+      </w:r>
+      <w:r>
+        <w:rPr>
+          <w:rStyle w:val="VerbatimStringTok"/>
+        </w:rPr>
+        <w:t xml:space="preserve">E:\新建文件夹 (2)\pecvd-fluent-mcp-main\pecvd-fluent-mcp-main\.venv\Scripts\python.exe</w:t>
+      </w:r>
+      <w:r>
+        <w:rPr>
+          <w:rStyle w:val="StringTok"/>
+        </w:rPr>
+        <w:t xml:space="preserve">'</w:t>
+      </w:r>
+      <w:r>
+        <w:br/>
+      </w:r>
+      <w:r>
+        <w:rPr>
+          <w:rStyle w:val="DataTypeTok"/>
+        </w:rPr>
+        <w:t xml:space="preserve">args</w:t>
+      </w:r>
+      <w:r>
+        <w:rPr>
+          <w:rStyle w:val="NormalTok"/>
+        </w:rPr>
+        <w:t xml:space="preserve"> </w:t>
+      </w:r>
+      <w:r>
+        <w:rPr>
+          <w:rStyle w:val="OperatorTok"/>
+        </w:rPr>
+        <w:t xml:space="preserve">=</w:t>
+      </w:r>
+      <w:r>
+        <w:rPr>
+          <w:rStyle w:val="NormalTok"/>
+        </w:rPr>
+        <w:t xml:space="preserve"> </w:t>
+      </w:r>
+      <w:r>
+        <w:rPr>
+          <w:rStyle w:val="OperatorTok"/>
+        </w:rPr>
+        <w:t xml:space="preserve">[</w:t>
+      </w:r>
+      <w:r>
+        <w:rPr>
+          <w:rStyle w:val="StringTok"/>
+        </w:rPr>
+        <w:t xml:space="preserve">"-m"</w:t>
+      </w:r>
+      <w:r>
+        <w:rPr>
+          <w:rStyle w:val="OperatorTok"/>
+        </w:rPr>
+        <w:t xml:space="preserve">,</w:t>
+      </w:r>
+      <w:r>
+        <w:rPr>
+          <w:rStyle w:val="NormalTok"/>
+        </w:rPr>
+        <w:t xml:space="preserve"> </w:t>
+      </w:r>
+      <w:r>
+        <w:rPr>
+          <w:rStyle w:val="StringTok"/>
+        </w:rPr>
+        <w:t xml:space="preserve">"pecvd_mcp.server"</w:t>
+      </w:r>
+      <w:r>
+        <w:rPr>
+          <w:rStyle w:val="OperatorTok"/>
+        </w:rPr>
+        <w:t xml:space="preserve">]</w:t>
+      </w:r>
+      <w:r>
+        <w:br/>
+      </w:r>
+      <w:r>
+        <w:rPr>
+          <w:rStyle w:val="DataTypeTok"/>
+        </w:rPr>
+        <w:t xml:space="preserve">startup_timeout_sec</w:t>
+      </w:r>
+      <w:r>
+        <w:rPr>
+          <w:rStyle w:val="NormalTok"/>
+        </w:rPr>
+        <w:t xml:space="preserve"> </w:t>
+      </w:r>
+      <w:r>
+        <w:rPr>
+          <w:rStyle w:val="OperatorTok"/>
+        </w:rPr>
+        <w:t xml:space="preserve">=</w:t>
+      </w:r>
+      <w:r>
+        <w:rPr>
+          <w:rStyle w:val="NormalTok"/>
+        </w:rPr>
+        <w:t xml:space="preserve"> </w:t>
+      </w:r>
+      <w:r>
+        <w:rPr>
+          <w:rStyle w:val="DecValTok"/>
+        </w:rPr>
+        <w:t xml:space="preserve">60</w:t>
+      </w:r>
+      <w:r>
+        <w:br/>
+      </w:r>
+      <w:r>
+        <w:rPr>
+          <w:rStyle w:val="DataTypeTok"/>
+        </w:rPr>
+        <w:t xml:space="preserve">tool_timeout_sec</w:t>
+      </w:r>
+      <w:r>
+        <w:rPr>
+          <w:rStyle w:val="NormalTok"/>
+        </w:rPr>
+        <w:t xml:space="preserve"> </w:t>
+      </w:r>
+      <w:r>
+        <w:rPr>
+          <w:rStyle w:val="OperatorTok"/>
+        </w:rPr>
+        <w:t xml:space="preserve">=</w:t>
+      </w:r>
+      <w:r>
+        <w:rPr>
+          <w:rStyle w:val="NormalTok"/>
+        </w:rPr>
+        <w:t xml:space="preserve"> </w:t>
+      </w:r>
+      <w:r>
+        <w:rPr>
+          <w:rStyle w:val="DecValTok"/>
+        </w:rPr>
+        <w:t xml:space="preserve">600</w:t>
+      </w:r>
+      <w:r>
+        <w:br/>
+      </w:r>
+      <w:r>
+        <w:br/>
+      </w:r>
+      <w:r>
+        <w:rPr>
+          <w:rStyle w:val="KeywordTok"/>
+        </w:rPr>
+        <w:t xml:space="preserve">[mcp_servers.pecvd-fluent.env]</w:t>
+      </w:r>
+      <w:r>
+        <w:br/>
+      </w:r>
+      <w:r>
+        <w:rPr>
+          <w:rStyle w:val="DataTypeTok"/>
+        </w:rPr>
+        <w:t xml:space="preserve">PECVD_WORKSPACE</w:t>
+      </w:r>
+      <w:r>
+        <w:rPr>
+          <w:rStyle w:val="NormalTok"/>
+        </w:rPr>
+        <w:t xml:space="preserve"> </w:t>
+      </w:r>
+      <w:r>
+        <w:rPr>
+          <w:rStyle w:val="OperatorTok"/>
+        </w:rPr>
+        <w:t xml:space="preserve">=</w:t>
+      </w:r>
+      <w:r>
+        <w:rPr>
+          <w:rStyle w:val="NormalTok"/>
+        </w:rPr>
+        <w:t xml:space="preserve"> </w:t>
+      </w:r>
+      <w:r>
+        <w:rPr>
+          <w:rStyle w:val="StringTok"/>
+        </w:rPr>
+        <w:t xml:space="preserve">'</w:t>
+      </w:r>
+      <w:r>
+        <w:rPr>
+          <w:rStyle w:val="VerbatimStringTok"/>
+        </w:rPr>
+        <w:t xml:space="preserve">E:\新建文件夹 (2)\pecvd-fluent-mcp-main\pecvd-fluent-mcp-main\runs</w:t>
+      </w:r>
+      <w:r>
+        <w:rPr>
+          <w:rStyle w:val="StringTok"/>
+        </w:rPr>
+        <w:t xml:space="preserve">'</w:t>
+      </w:r>
+      <w:r>
+        <w:br/>
+      </w:r>
+      <w:r>
+        <w:rPr>
+          <w:rStyle w:val="DataTypeTok"/>
+        </w:rPr>
+        <w:t xml:space="preserve">PECVD_PACKAGE_ROOT</w:t>
+      </w:r>
+      <w:r>
+        <w:rPr>
+          <w:rStyle w:val="NormalTok"/>
+        </w:rPr>
+        <w:t xml:space="preserve"> </w:t>
+      </w:r>
+      <w:r>
+        <w:rPr>
+          <w:rStyle w:val="OperatorTok"/>
+        </w:rPr>
+        <w:t xml:space="preserve">=</w:t>
+      </w:r>
+      <w:r>
+        <w:rPr>
+          <w:rStyle w:val="NormalTok"/>
+        </w:rPr>
+        <w:t xml:space="preserve"> </w:t>
+      </w:r>
+      <w:r>
+        <w:rPr>
+          <w:rStyle w:val="StringTok"/>
+        </w:rPr>
+        <w:t xml:space="preserve">'</w:t>
+      </w:r>
+      <w:r>
+        <w:rPr>
+          <w:rStyle w:val="VerbatimStringTok"/>
+        </w:rPr>
+        <w:t xml:space="preserve">E:\新建文件夹 (2)\pecvd-fluent-mcp-main\pecvd-fluent-mcp-main</w:t>
+      </w:r>
+      <w:r>
+        <w:rPr>
+          <w:rStyle w:val="StringTok"/>
+        </w:rPr>
+        <w:t xml:space="preserve">'</w:t>
+      </w:r>
+    </w:p>
+    <w:p>
+      <w:pPr>
+        <w:pStyle w:val="FirstParagraph"/>
+      </w:pPr>
+      <w:r>
+        <w:t xml:space="preserve">若以后搬动工程或在其他电脑安装，要改成新的真实路径。</w:t>
+      </w:r>
+      <w:r>
+        <w:rPr>
+          <w:rStyle w:val="VerbatimChar"/>
+        </w:rPr>
+        <w:t xml:space="preserve">command</w:t>
+      </w:r>
+      <w:r>
+        <w:t xml:space="preserve"> </w:t>
+      </w:r>
+      <w:r>
+        <w:t xml:space="preserve">是本工程虚拟环境里的 Python，不是</w:t>
+      </w:r>
+      <w:r>
+        <w:t xml:space="preserve"> </w:t>
+      </w:r>
+      <w:r>
+        <w:rPr>
+          <w:rStyle w:val="VerbatimChar"/>
+        </w:rPr>
+        <w:t xml:space="preserve">fluent.exe</w:t>
+      </w:r>
+      <w:r>
+        <w:t xml:space="preserve">。截图中 Fluent 已识别为</w:t>
+      </w:r>
+      <w:r>
+        <w:t xml:space="preserve"> </w:t>
+      </w:r>
+      <w:r>
+        <w:rPr>
+          <w:rStyle w:val="VerbatimChar"/>
+        </w:rPr>
+        <w:t xml:space="preserve">E:\Program Files\ANSYS Inc\v241\fluent\ntbin\win64\fluent.exe</w:t>
+      </w:r>
+      <w:r>
+        <w:t xml:space="preserve">，无需再用它替换 Codex 的启动命令。</w:t>
+      </w:r>
+    </w:p>
+    <w:p>
+      <w:pPr>
+        <w:pStyle w:val="BodyText"/>
+      </w:pPr>
+      <w:r>
+        <w:rPr>
+          <w:b/>
+          <w:bCs/>
+        </w:rPr>
+        <w:t xml:space="preserve">Codex 使用 TOML 配置。安装脚本生成的</w:t>
+      </w:r>
+      <w:r>
+        <w:rPr>
+          <w:b/>
+          <w:bCs/>
+        </w:rPr>
+        <w:t xml:space="preserve"> </w:t>
+      </w:r>
+      <w:r>
+        <w:rPr>
+          <w:rStyle w:val="VerbatimChar"/>
+          <w:b/>
+          <w:bCs/>
+        </w:rPr>
+        <w:t xml:space="preserve">mcp-config.generated.json</w:t>
+      </w:r>
+      <w:r>
+        <w:rPr>
+          <w:b/>
+          <w:bCs/>
+        </w:rPr>
+        <w:t xml:space="preserve"> </w:t>
+      </w:r>
+      <w:r>
+        <w:rPr>
+          <w:b/>
+          <w:bCs/>
+        </w:rPr>
+        <w:t xml:space="preserve">是其他兼容 JSON 配置客户端的参考，不能原样粘贴进 Codex 的</w:t>
+      </w:r>
+      <w:r>
+        <w:rPr>
+          <w:b/>
+          <w:bCs/>
+        </w:rPr>
+        <w:t xml:space="preserve"> </w:t>
+      </w:r>
+      <w:r>
+        <w:rPr>
+          <w:rStyle w:val="VerbatimChar"/>
+          <w:b/>
+          <w:bCs/>
+        </w:rPr>
+        <w:t xml:space="preserve">config.toml</w:t>
+      </w:r>
+      <w:r>
+        <w:rPr>
+          <w:b/>
+          <w:bCs/>
+        </w:rPr>
+        <w:t xml:space="preserve">。</w:t>
+      </w:r>
+    </w:p>
+    <w:bookmarkEnd w:id="27"/>
+    <w:bookmarkStart w:id="28" w:name="X563fb5dc1590f5fd883a36054bb1e6da2cca2ee"/>
+    <w:p>
+      <w:pPr>
+        <w:pStyle w:val="Heading3"/>
+      </w:pPr>
+      <w:r>
+        <w:t xml:space="preserve">2.2 重启并检查工具是否可调用</w:t>
+      </w:r>
+    </w:p>
+    <w:p>
+      <w:pPr>
+        <w:pStyle w:val="FirstParagraph"/>
+      </w:pPr>
+      <w:r>
+        <w:t xml:space="preserve">保存后完全退出并重启 Codex，在本地会话输入：</w:t>
+      </w:r>
+    </w:p>
+    <w:p>
+      <w:pPr>
+        <w:pStyle w:val="BlockText"/>
+      </w:pPr>
+      <w:r>
+        <w:t xml:space="preserve">请列出 pecvd-fluent 的可用工具，并实际调用 check_environment，返回检测结果。</w:t>
+      </w:r>
+    </w:p>
+    <w:p>
+      <w:pPr>
+        <w:pStyle w:val="FirstParagraph"/>
+      </w:pPr>
+      <w:r>
+        <w:t xml:space="preserve">应能发现本包工具并返回 Windows、Python 版本、依赖、真实 Fluent 路径及工程目录。只有显示代码或复述工具名，不等于实际工具调用成功。</w:t>
+      </w:r>
+    </w:p>
+    <w:p>
+      <w:pPr>
+        <w:pStyle w:val="BodyText"/>
+      </w:pPr>
+      <w:r>
+        <w:t xml:space="preserve">此时返回</w:t>
+      </w:r>
+      <w:r>
+        <w:t xml:space="preserve"> </w:t>
+      </w:r>
+      <w:r>
+        <w:rPr>
+          <w:rStyle w:val="VerbatimChar"/>
+        </w:rPr>
+        <w:t xml:space="preserve">phase: disconnected</w:t>
+      </w:r>
+      <w:r>
+        <w:t xml:space="preserve">、</w:t>
+      </w:r>
+      <w:r>
+        <w:rPr>
+          <w:rStyle w:val="VerbatimChar"/>
+        </w:rPr>
+        <w:t xml:space="preserve">license_verified: false</w:t>
+      </w:r>
+      <w:r>
+        <w:t xml:space="preserve"> </w:t>
+      </w:r>
+      <w:r>
+        <w:t xml:space="preserve">可以是正常的：尚未启动本桥管理的 Fluent 进程，还没有检验本次许可证。不能据此判断安装失败；实际启动在第三节进行。</w:t>
+      </w:r>
+    </w:p>
+    <w:bookmarkEnd w:id="28"/>
+    <w:bookmarkStart w:id="29" w:name="Xeb47ee485268956ac088495d2c7930775d16324"/>
+    <w:p>
+      <w:pPr>
+        <w:pStyle w:val="Heading3"/>
+      </w:pPr>
+      <w:r>
+        <w:t xml:space="preserve">2.3 使用其他客户端时</w:t>
+      </w:r>
+    </w:p>
+    <w:p>
+      <w:pPr>
+        <w:pStyle w:val="FirstParagraph"/>
+      </w:pPr>
+      <w:r>
+        <w:t xml:space="preserve">Claude Desktop、Cursor／VS Code 等支持本地 MCP 的客户端也可以使用工程内</w:t>
+      </w:r>
+      <w:r>
+        <w:t xml:space="preserve"> </w:t>
+      </w:r>
+      <w:r>
+        <w:rPr>
+          <w:rStyle w:val="VerbatimChar"/>
+        </w:rPr>
+        <w:t xml:space="preserve">.venv\Scripts\python.exe</w:t>
+      </w:r>
+      <w:r>
+        <w:t xml:space="preserve">，参数为两个字符串</w:t>
+      </w:r>
+      <w:r>
+        <w:t xml:space="preserve"> </w:t>
+      </w:r>
+      <w:r>
+        <w:rPr>
+          <w:rStyle w:val="VerbatimChar"/>
+        </w:rPr>
+        <w:t xml:space="preserve">-m</w:t>
+      </w:r>
+      <w:r>
+        <w:t xml:space="preserve">、</w:t>
+      </w:r>
+      <w:r>
+        <w:rPr>
+          <w:rStyle w:val="VerbatimChar"/>
+        </w:rPr>
+        <w:t xml:space="preserve">pecvd_mcp.server</w:t>
+      </w:r>
+      <w:r>
+        <w:t xml:space="preserve">，环境变量和上面一致。请按对应客户端的配置格式填写；兼容</w:t>
+      </w:r>
+      <w:r>
+        <w:t xml:space="preserve"> </w:t>
+      </w:r>
+      <w:r>
+        <w:rPr>
+          <w:rStyle w:val="VerbatimChar"/>
+        </w:rPr>
+        <w:t xml:space="preserve">mcpServers</w:t>
+      </w:r>
+      <w:r>
+        <w:t xml:space="preserve"> </w:t>
+      </w:r>
+      <w:r>
+        <w:t xml:space="preserve">JSON 的客户端可参考</w:t>
+      </w:r>
+      <w:r>
+        <w:t xml:space="preserve"> </w:t>
+      </w:r>
+      <w:r>
+        <w:rPr>
+          <w:rStyle w:val="VerbatimChar"/>
+        </w:rPr>
+        <w:t xml:space="preserve">mcp-config.generated.json</w:t>
+      </w:r>
+      <w:r>
+        <w:t xml:space="preserve">。</w:t>
+      </w:r>
+    </w:p>
+    <w:p>
+      <w:pPr>
+        <w:pStyle w:val="BodyText"/>
+      </w:pPr>
+      <w:r>
+        <w:rPr>
+          <w:rStyle w:val="VerbatimChar"/>
+        </w:rPr>
+        <w:t xml:space="preserve">Start_MCP.cmd</w:t>
+      </w:r>
+      <w:r>
+        <w:t xml:space="preserve"> </w:t>
+      </w:r>
+      <w:r>
+        <w:t xml:space="preserve">是另一种启动入口，供支持命令脚本的客户端使用；双击后等待输入是正常的，它不是带按钮的应用程序。由 Codex 按配置启动即可，不需要另外手动双击启动 MCP。MCP 本包只用 STDIO，不需要公网 IP、开放端口或远程桌面密码。</w:t>
+      </w:r>
+    </w:p>
+    <w:bookmarkEnd w:id="29"/>
+    <w:bookmarkEnd w:id="30"/>
+    <w:bookmarkStart w:id="31" w:name="三连接后的第一条指令"/>
+    <w:p>
+      <w:pPr>
+        <w:pStyle w:val="Heading2"/>
+      </w:pPr>
+      <w:r>
+        <w:t xml:space="preserve">三、连接后的第一条指令</w:t>
+      </w:r>
+    </w:p>
+    <w:p>
+      <w:pPr>
+        <w:pStyle w:val="FirstParagraph"/>
+      </w:pPr>
+      <w:r>
+        <w:t xml:space="preserve">第二节的实际工具调用通过后，把下面这段发给已接入 MCP 的 Codex 本地会话：</w:t>
+      </w:r>
+    </w:p>
+    <w:p>
+      <w:pPr>
+        <w:pStyle w:val="BlockText"/>
+      </w:pPr>
+      <w:r>
+        <w:t xml:space="preserve">使用 pecvd-fluent 工具。先 check_environment，再 read_paper_baseline。创建一个新项目 first_check_01，生成 baseline 网格，启动 Fluent 2024 R1 的二维双精度界面，载入并检查网格。读 mesh-check.trn，确认没有负体积和拓扑错误后，配置非反应连接测试，初始化，先迭代 25 步并保存 case/data。检查日志，不要把该测试称为等离子体或沉积验证，不要覆盖旧项目。</w:t>
+      </w:r>
+    </w:p>
+    <w:p>
+      <w:pPr>
+        <w:pStyle w:val="FirstParagraph"/>
+      </w:pPr>
+      <w:r>
+        <w:t xml:space="preserve">真实调用顺序：</w:t>
       </w:r>
     </w:p>
     <w:p>
@@ -575,16 +1297,13 @@
         </w:numPr>
       </w:pPr>
       <w:r>
-        <w:t xml:space="preserve">名称：</w:t>
-      </w:r>
-      <w:r>
-        <w:rPr>
-          <w:rStyle w:val="VerbatimChar"/>
-        </w:rPr>
-        <w:t xml:space="preserve">pecvd-fluent</w:t>
-      </w:r>
-      <w:r>
-        <w:t xml:space="preserve">。</w:t>
+        <w:rPr>
+          <w:rStyle w:val="VerbatimChar"/>
+        </w:rPr>
+        <w:t xml:space="preserve">check_environment()</w:t>
+      </w:r>
+      <w:r>
+        <w:t xml:space="preserve">，确认版本、路径与依赖。</w:t>
       </w:r>
     </w:p>
     <w:p>
@@ -596,22 +1315,13 @@
         </w:numPr>
       </w:pPr>
       <w:r>
-        <w:t xml:space="preserve">启动命令：本工程</w:t>
-      </w:r>
-      <w:r>
-        <w:t xml:space="preserve"> </w:t>
-      </w:r>
-      <w:r>
-        <w:rPr>
-          <w:rStyle w:val="VerbatimChar"/>
-        </w:rPr>
-        <w:t xml:space="preserve">.venv\Scripts\python.exe</w:t>
-      </w:r>
-      <w:r>
-        <w:t xml:space="preserve"> </w:t>
-      </w:r>
-      <w:r>
-        <w:t xml:space="preserve">的完整路径。</w:t>
+        <w:rPr>
+          <w:rStyle w:val="VerbatimChar"/>
+        </w:rPr>
+        <w:t xml:space="preserve">read_paper_baseline()</w:t>
+      </w:r>
+      <w:r>
+        <w:t xml:space="preserve">，读取已摘录工况和缺失项。</w:t>
       </w:r>
     </w:p>
     <w:p>
@@ -623,16 +1333,13 @@
         </w:numPr>
       </w:pPr>
       <w:r>
-        <w:t xml:space="preserve">参数：</w:t>
-      </w:r>
-      <w:r>
-        <w:rPr>
-          <w:rStyle w:val="VerbatimChar"/>
-        </w:rPr>
-        <w:t xml:space="preserve">-m pecvd_mcp.server</w:t>
-      </w:r>
-      <w:r>
-        <w:t xml:space="preserve">，这是两个参数，不是一个含空格的参数。</w:t>
+        <w:rPr>
+          <w:rStyle w:val="VerbatimChar"/>
+        </w:rPr>
+        <w:t xml:space="preserve">create_connection_project("first_check_01")</w:t>
+      </w:r>
+      <w:r>
+        <w:t xml:space="preserve">，生成新网格和项目记录。</w:t>
       </w:r>
     </w:p>
     <w:p>
@@ -644,90 +1351,157 @@
         </w:numPr>
       </w:pPr>
       <w:r>
-        <w:t xml:space="preserve">环境变量：按</w:t>
-      </w:r>
-      <w:r>
-        <w:t xml:space="preserve"> </w:t>
-      </w:r>
-      <w:r>
-        <w:rPr>
-          <w:rStyle w:val="VerbatimChar"/>
-        </w:rPr>
-        <w:t xml:space="preserve">mcp-config.generated.json</w:t>
-      </w:r>
-      <w:r>
-        <w:t xml:space="preserve"> </w:t>
-      </w:r>
-      <w:r>
-        <w:t xml:space="preserve">中生成的实际路径填写。</w:t>
-      </w:r>
-    </w:p>
-    <w:p>
-      <w:pPr>
-        <w:pStyle w:val="FirstParagraph"/>
-      </w:pPr>
-      <w:r>
-        <w:t xml:space="preserve">对使用 JSON 配置的 Claude Desktop，通常可在“设置 → 开发者 → 编辑配置”打开配置文件；Windows 常见位置为</w:t>
-      </w:r>
-      <w:r>
-        <w:t xml:space="preserve"> </w:t>
-      </w:r>
-      <w:r>
-        <w:rPr>
-          <w:rStyle w:val="VerbatimChar"/>
-        </w:rPr>
-        <w:t xml:space="preserve">%APPDATA%\Claude\claude_desktop_config.json</w:t>
-      </w:r>
-      <w:r>
-        <w:t xml:space="preserve">。把生成文件中的</w:t>
-      </w:r>
-      <w:r>
-        <w:t xml:space="preserve"> </w:t>
-      </w:r>
-      <w:r>
-        <w:rPr>
-          <w:rStyle w:val="VerbatimChar"/>
-        </w:rPr>
-        <w:t xml:space="preserve">pecvd-fluent</w:t>
-      </w:r>
-      <w:r>
-        <w:t xml:space="preserve"> </w:t>
-      </w:r>
-      <w:r>
-        <w:t xml:space="preserve">服务合并到已有</w:t>
-      </w:r>
-      <w:r>
-        <w:t xml:space="preserve"> </w:t>
-      </w:r>
-      <w:r>
-        <w:rPr>
-          <w:rStyle w:val="VerbatimChar"/>
-        </w:rPr>
-        <w:t xml:space="preserve">mcpServers</w:t>
-      </w:r>
-      <w:r>
-        <w:t xml:space="preserve">，保留你原来的其他服务。完全退出并重启客户端。</w:t>
-      </w:r>
-    </w:p>
-    <w:p>
-      <w:pPr>
-        <w:pStyle w:val="BodyText"/>
-      </w:pPr>
-      <w:r>
-        <w:t xml:space="preserve">Cursor／VS Code 等支持 MCP 的客户端也可使用相同启动命令，配置格式以各自界面为准。</w:t>
+        <w:rPr>
+          <w:rStyle w:val="VerbatimChar"/>
+        </w:rPr>
+        <w:t xml:space="preserve">launch_fluent("first_check_01")</w:t>
+      </w:r>
+      <w:r>
+        <w:t xml:space="preserve">，启动</w:t>
       </w:r>
       <w:r>
         <w:rPr>
           <w:b/>
           <w:bCs/>
         </w:rPr>
-        <w:t xml:space="preserve">普通聊天网页不会因为在电脑上启动本包就自动获得本地工具。</w:t>
-      </w:r>
-      <w:r>
-        <w:t xml:space="preserve"> </w:t>
-      </w:r>
-      <w:r>
-        <w:t xml:space="preserve">必须在实际支持本地 MCP 的客户端中建立连接。</w:t>
+        <w:t xml:space="preserve">单独的新 Fluent 进程</w:t>
+      </w:r>
+      <w:r>
+        <w:t xml:space="preserve">，使用你的本地许可；保留你已打开的其他工程。</w:t>
+      </w:r>
+    </w:p>
+    <w:p>
+      <w:pPr>
+        <w:pStyle w:val="Compact"/>
+        <w:numPr>
+          <w:ilvl w:val="0"/>
+          <w:numId w:val="1002"/>
+        </w:numPr>
+      </w:pPr>
+      <w:r>
+        <w:rPr>
+          <w:rStyle w:val="VerbatimChar"/>
+        </w:rPr>
+        <w:t xml:space="preserve">load_and_check_gap_mesh("first_check_01")</w:t>
+      </w:r>
+      <w:r>
+        <w:t xml:space="preserve">。</w:t>
+      </w:r>
+    </w:p>
+    <w:p>
+      <w:pPr>
+        <w:pStyle w:val="Compact"/>
+        <w:numPr>
+          <w:ilvl w:val="0"/>
+          <w:numId w:val="1002"/>
+        </w:numPr>
+      </w:pPr>
+      <w:r>
+        <w:rPr>
+          <w:rStyle w:val="VerbatimChar"/>
+        </w:rPr>
+        <w:t xml:space="preserve">read_project_text("first_check_01", "mesh-check.trn")</w:t>
+      </w:r>
+      <w:r>
+        <w:t xml:space="preserve">。需要实际检查体积、拓扑和单位；有错误就停止，保留日志排查。</w:t>
+      </w:r>
+    </w:p>
+    <w:p>
+      <w:pPr>
+        <w:pStyle w:val="Compact"/>
+        <w:numPr>
+          <w:ilvl w:val="0"/>
+          <w:numId w:val="1002"/>
+        </w:numPr>
+      </w:pPr>
+      <w:r>
+        <w:t xml:space="preserve">检查通过才调用</w:t>
+      </w:r>
+      <w:r>
+        <w:t xml:space="preserve"> </w:t>
+      </w:r>
+      <w:r>
+        <w:rPr>
+          <w:rStyle w:val="VerbatimChar"/>
+        </w:rPr>
+        <w:t xml:space="preserve">configure_nonreactive_connection_test("first_check_01", true)</w:t>
+      </w:r>
+      <w:r>
+        <w:t xml:space="preserve">。</w:t>
+      </w:r>
+    </w:p>
+    <w:p>
+      <w:pPr>
+        <w:pStyle w:val="Compact"/>
+        <w:numPr>
+          <w:ilvl w:val="0"/>
+          <w:numId w:val="1002"/>
+        </w:numPr>
+      </w:pPr>
+      <w:r>
+        <w:rPr>
+          <w:rStyle w:val="VerbatimChar"/>
+        </w:rPr>
+        <w:t xml:space="preserve">initialize_connection_test("first_check_01")</w:t>
+      </w:r>
+      <w:r>
+        <w:t xml:space="preserve">。</w:t>
+      </w:r>
+    </w:p>
+    <w:p>
+      <w:pPr>
+        <w:pStyle w:val="Compact"/>
+        <w:numPr>
+          <w:ilvl w:val="0"/>
+          <w:numId w:val="1002"/>
+        </w:numPr>
+      </w:pPr>
+      <w:r>
+        <w:rPr>
+          <w:rStyle w:val="VerbatimChar"/>
+        </w:rPr>
+        <w:t xml:space="preserve">iterate_connection_test("first_check_01", 25)</w:t>
+      </w:r>
+      <w:r>
+        <w:t xml:space="preserve">，读取返回的迭代日志。</w:t>
+      </w:r>
+    </w:p>
+    <w:p>
+      <w:pPr>
+        <w:pStyle w:val="Compact"/>
+        <w:numPr>
+          <w:ilvl w:val="0"/>
+          <w:numId w:val="1002"/>
+        </w:numPr>
+      </w:pPr>
+      <w:r>
+        <w:rPr>
+          <w:rStyle w:val="VerbatimChar"/>
+        </w:rPr>
+        <w:t xml:space="preserve">save_case_and_data("first_check_01")</w:t>
+      </w:r>
+      <w:r>
+        <w:t xml:space="preserve">，再关闭</w:t>
+      </w:r>
+      <w:r>
+        <w:t xml:space="preserve"> </w:t>
+      </w:r>
+      <w:r>
+        <w:rPr>
+          <w:rStyle w:val="VerbatimChar"/>
+        </w:rPr>
+        <w:t xml:space="preserve">close_managed_fluent()</w:t>
+      </w:r>
+      <w:r>
+        <w:t xml:space="preserve">。</w:t>
+      </w:r>
+    </w:p>
+    <w:p>
+      <w:pPr>
+        <w:pStyle w:val="FirstParagraph"/>
+      </w:pPr>
+      <w:r>
+        <w:t xml:space="preserve">每次迭代最多 500 步。迭代完成只表示命令执行结束，收敛还需检查残差、进出口质量守恒和监测量。退出 MCP 客户端会结束它管理的 Fluent 会话，退出前先保存。</w:t>
       </w:r>
     </w:p>
     <w:p>
@@ -735,471 +1509,29 @@
         <w:pStyle w:val="BodyText"/>
       </w:pPr>
       <w:r>
-        <w:t xml:space="preserve">安装生成的配置会像下面这样，但不要照抄示例盘符，应使用你生成文件里的真实路径：</w:t>
-      </w:r>
-    </w:p>
-    <w:p>
-      <w:pPr>
-        <w:pStyle w:val="SourceCode"/>
-      </w:pPr>
-      <w:r>
-        <w:rPr>
-          <w:rStyle w:val="FunctionTok"/>
-        </w:rPr>
-        <w:t xml:space="preserve">{</w:t>
-      </w:r>
-      <w:r>
-        <w:br/>
-      </w:r>
-      <w:r>
-        <w:rPr>
-          <w:rStyle w:val="NormalTok"/>
-        </w:rPr>
-        <w:t xml:space="preserve">  </w:t>
-      </w:r>
-      <w:r>
-        <w:rPr>
-          <w:rStyle w:val="DataTypeTok"/>
-        </w:rPr>
-        <w:t xml:space="preserve">"mcpServers"</w:t>
-      </w:r>
-      <w:r>
-        <w:rPr>
-          <w:rStyle w:val="FunctionTok"/>
-        </w:rPr>
-        <w:t xml:space="preserve">:</w:t>
-      </w:r>
-      <w:r>
-        <w:rPr>
-          <w:rStyle w:val="NormalTok"/>
-        </w:rPr>
-        <w:t xml:space="preserve"> </w:t>
-      </w:r>
-      <w:r>
-        <w:rPr>
-          <w:rStyle w:val="FunctionTok"/>
-        </w:rPr>
-        <w:t xml:space="preserve">{</w:t>
-      </w:r>
-      <w:r>
-        <w:br/>
-      </w:r>
-      <w:r>
-        <w:rPr>
-          <w:rStyle w:val="NormalTok"/>
-        </w:rPr>
-        <w:t xml:space="preserve">    </w:t>
-      </w:r>
-      <w:r>
-        <w:rPr>
-          <w:rStyle w:val="DataTypeTok"/>
-        </w:rPr>
-        <w:t xml:space="preserve">"pecvd-fluent"</w:t>
-      </w:r>
-      <w:r>
-        <w:rPr>
-          <w:rStyle w:val="FunctionTok"/>
-        </w:rPr>
-        <w:t xml:space="preserve">:</w:t>
-      </w:r>
-      <w:r>
-        <w:rPr>
-          <w:rStyle w:val="NormalTok"/>
-        </w:rPr>
-        <w:t xml:space="preserve"> </w:t>
-      </w:r>
-      <w:r>
-        <w:rPr>
-          <w:rStyle w:val="FunctionTok"/>
-        </w:rPr>
-        <w:t xml:space="preserve">{</w:t>
-      </w:r>
-      <w:r>
-        <w:br/>
-      </w:r>
-      <w:r>
-        <w:rPr>
-          <w:rStyle w:val="NormalTok"/>
-        </w:rPr>
-        <w:t xml:space="preserve">      </w:t>
-      </w:r>
-      <w:r>
-        <w:rPr>
-          <w:rStyle w:val="DataTypeTok"/>
-        </w:rPr>
-        <w:t xml:space="preserve">"command"</w:t>
-      </w:r>
-      <w:r>
-        <w:rPr>
-          <w:rStyle w:val="FunctionTok"/>
-        </w:rPr>
-        <w:t xml:space="preserve">:</w:t>
-      </w:r>
-      <w:r>
-        <w:rPr>
-          <w:rStyle w:val="NormalTok"/>
-        </w:rPr>
-        <w:t xml:space="preserve"> </w:t>
-      </w:r>
-      <w:r>
-        <w:rPr>
-          <w:rStyle w:val="StringTok"/>
-        </w:rPr>
-        <w:t xml:space="preserve">"C:</w:t>
-      </w:r>
-      <w:r>
-        <w:rPr>
-          <w:rStyle w:val="CharTok"/>
-        </w:rPr>
-        <w:t xml:space="preserve">\\</w:t>
-      </w:r>
-      <w:r>
-        <w:rPr>
-          <w:rStyle w:val="StringTok"/>
-        </w:rPr>
-        <w:t xml:space="preserve">PECVD</w:t>
-      </w:r>
-      <w:r>
-        <w:rPr>
-          <w:rStyle w:val="CharTok"/>
-        </w:rPr>
-        <w:t xml:space="preserve">\\</w:t>
-      </w:r>
-      <w:r>
-        <w:rPr>
-          <w:rStyle w:val="StringTok"/>
-        </w:rPr>
-        <w:t xml:space="preserve">pecvd-fluent-mcp</w:t>
-      </w:r>
-      <w:r>
-        <w:rPr>
-          <w:rStyle w:val="CharTok"/>
-        </w:rPr>
-        <w:t xml:space="preserve">\\</w:t>
-      </w:r>
-      <w:r>
-        <w:rPr>
-          <w:rStyle w:val="StringTok"/>
-        </w:rPr>
-        <w:t xml:space="preserve">.venv</w:t>
-      </w:r>
-      <w:r>
-        <w:rPr>
-          <w:rStyle w:val="CharTok"/>
-        </w:rPr>
-        <w:t xml:space="preserve">\\</w:t>
-      </w:r>
-      <w:r>
-        <w:rPr>
-          <w:rStyle w:val="StringTok"/>
-        </w:rPr>
-        <w:t xml:space="preserve">Scripts</w:t>
-      </w:r>
-      <w:r>
-        <w:rPr>
-          <w:rStyle w:val="CharTok"/>
-        </w:rPr>
-        <w:t xml:space="preserve">\\</w:t>
-      </w:r>
-      <w:r>
-        <w:rPr>
-          <w:rStyle w:val="StringTok"/>
-        </w:rPr>
-        <w:t xml:space="preserve">python.exe"</w:t>
-      </w:r>
-      <w:r>
-        <w:rPr>
-          <w:rStyle w:val="FunctionTok"/>
-        </w:rPr>
-        <w:t xml:space="preserve">,</w:t>
-      </w:r>
-      <w:r>
-        <w:br/>
-      </w:r>
-      <w:r>
-        <w:rPr>
-          <w:rStyle w:val="NormalTok"/>
-        </w:rPr>
-        <w:t xml:space="preserve">      </w:t>
-      </w:r>
-      <w:r>
-        <w:rPr>
-          <w:rStyle w:val="DataTypeTok"/>
-        </w:rPr>
-        <w:t xml:space="preserve">"args"</w:t>
-      </w:r>
-      <w:r>
-        <w:rPr>
-          <w:rStyle w:val="FunctionTok"/>
-        </w:rPr>
-        <w:t xml:space="preserve">:</w:t>
-      </w:r>
-      <w:r>
-        <w:rPr>
-          <w:rStyle w:val="NormalTok"/>
-        </w:rPr>
-        <w:t xml:space="preserve"> </w:t>
-      </w:r>
-      <w:r>
-        <w:rPr>
-          <w:rStyle w:val="OtherTok"/>
-        </w:rPr>
-        <w:t xml:space="preserve">[</w:t>
-      </w:r>
-      <w:r>
-        <w:rPr>
-          <w:rStyle w:val="StringTok"/>
-        </w:rPr>
-        <w:t xml:space="preserve">"-m"</w:t>
-      </w:r>
-      <w:r>
-        <w:rPr>
-          <w:rStyle w:val="OtherTok"/>
-        </w:rPr>
-        <w:t xml:space="preserve">,</w:t>
-      </w:r>
-      <w:r>
-        <w:rPr>
-          <w:rStyle w:val="NormalTok"/>
-        </w:rPr>
-        <w:t xml:space="preserve"> </w:t>
-      </w:r>
-      <w:r>
-        <w:rPr>
-          <w:rStyle w:val="StringTok"/>
-        </w:rPr>
-        <w:t xml:space="preserve">"pecvd_mcp.server"</w:t>
-      </w:r>
-      <w:r>
-        <w:rPr>
-          <w:rStyle w:val="OtherTok"/>
-        </w:rPr>
-        <w:t xml:space="preserve">]</w:t>
-      </w:r>
-      <w:r>
-        <w:rPr>
-          <w:rStyle w:val="FunctionTok"/>
-        </w:rPr>
-        <w:t xml:space="preserve">,</w:t>
-      </w:r>
-      <w:r>
-        <w:br/>
-      </w:r>
-      <w:r>
-        <w:rPr>
-          <w:rStyle w:val="NormalTok"/>
-        </w:rPr>
-        <w:t xml:space="preserve">      </w:t>
-      </w:r>
-      <w:r>
-        <w:rPr>
-          <w:rStyle w:val="DataTypeTok"/>
-        </w:rPr>
-        <w:t xml:space="preserve">"env"</w:t>
-      </w:r>
-      <w:r>
-        <w:rPr>
-          <w:rStyle w:val="FunctionTok"/>
-        </w:rPr>
-        <w:t xml:space="preserve">:</w:t>
-      </w:r>
-      <w:r>
-        <w:rPr>
-          <w:rStyle w:val="NormalTok"/>
-        </w:rPr>
-        <w:t xml:space="preserve"> </w:t>
-      </w:r>
-      <w:r>
-        <w:rPr>
-          <w:rStyle w:val="FunctionTok"/>
-        </w:rPr>
-        <w:t xml:space="preserve">{</w:t>
-      </w:r>
-      <w:r>
-        <w:br/>
-      </w:r>
-      <w:r>
-        <w:rPr>
-          <w:rStyle w:val="NormalTok"/>
-        </w:rPr>
-        <w:t xml:space="preserve">        </w:t>
-      </w:r>
-      <w:r>
-        <w:rPr>
-          <w:rStyle w:val="DataTypeTok"/>
-        </w:rPr>
-        <w:t xml:space="preserve">"PECVD_WORKSPACE"</w:t>
-      </w:r>
-      <w:r>
-        <w:rPr>
-          <w:rStyle w:val="FunctionTok"/>
-        </w:rPr>
-        <w:t xml:space="preserve">:</w:t>
-      </w:r>
-      <w:r>
-        <w:rPr>
-          <w:rStyle w:val="NormalTok"/>
-        </w:rPr>
-        <w:t xml:space="preserve"> </w:t>
-      </w:r>
-      <w:r>
-        <w:rPr>
-          <w:rStyle w:val="StringTok"/>
-        </w:rPr>
-        <w:t xml:space="preserve">"C:</w:t>
-      </w:r>
-      <w:r>
-        <w:rPr>
-          <w:rStyle w:val="CharTok"/>
-        </w:rPr>
-        <w:t xml:space="preserve">\\</w:t>
-      </w:r>
-      <w:r>
-        <w:rPr>
-          <w:rStyle w:val="StringTok"/>
-        </w:rPr>
-        <w:t xml:space="preserve">PECVD</w:t>
-      </w:r>
-      <w:r>
-        <w:rPr>
-          <w:rStyle w:val="CharTok"/>
-        </w:rPr>
-        <w:t xml:space="preserve">\\</w:t>
-      </w:r>
-      <w:r>
-        <w:rPr>
-          <w:rStyle w:val="StringTok"/>
-        </w:rPr>
-        <w:t xml:space="preserve">pecvd-fluent-mcp</w:t>
-      </w:r>
-      <w:r>
-        <w:rPr>
-          <w:rStyle w:val="CharTok"/>
-        </w:rPr>
-        <w:t xml:space="preserve">\\</w:t>
-      </w:r>
-      <w:r>
-        <w:rPr>
-          <w:rStyle w:val="StringTok"/>
-        </w:rPr>
-        <w:t xml:space="preserve">runs"</w:t>
-      </w:r>
-      <w:r>
-        <w:rPr>
-          <w:rStyle w:val="FunctionTok"/>
-        </w:rPr>
-        <w:t xml:space="preserve">,</w:t>
-      </w:r>
-      <w:r>
-        <w:br/>
-      </w:r>
-      <w:r>
-        <w:rPr>
-          <w:rStyle w:val="NormalTok"/>
-        </w:rPr>
-        <w:t xml:space="preserve">        </w:t>
-      </w:r>
-      <w:r>
-        <w:rPr>
-          <w:rStyle w:val="DataTypeTok"/>
-        </w:rPr>
-        <w:t xml:space="preserve">"PECVD_PACKAGE_ROOT"</w:t>
-      </w:r>
-      <w:r>
-        <w:rPr>
-          <w:rStyle w:val="FunctionTok"/>
-        </w:rPr>
-        <w:t xml:space="preserve">:</w:t>
-      </w:r>
-      <w:r>
-        <w:rPr>
-          <w:rStyle w:val="NormalTok"/>
-        </w:rPr>
-        <w:t xml:space="preserve"> </w:t>
-      </w:r>
-      <w:r>
-        <w:rPr>
-          <w:rStyle w:val="StringTok"/>
-        </w:rPr>
-        <w:t xml:space="preserve">"C:</w:t>
-      </w:r>
-      <w:r>
-        <w:rPr>
-          <w:rStyle w:val="CharTok"/>
-        </w:rPr>
-        <w:t xml:space="preserve">\\</w:t>
-      </w:r>
-      <w:r>
-        <w:rPr>
-          <w:rStyle w:val="StringTok"/>
-        </w:rPr>
-        <w:t xml:space="preserve">PECVD</w:t>
-      </w:r>
-      <w:r>
-        <w:rPr>
-          <w:rStyle w:val="CharTok"/>
-        </w:rPr>
-        <w:t xml:space="preserve">\\</w:t>
-      </w:r>
-      <w:r>
-        <w:rPr>
-          <w:rStyle w:val="StringTok"/>
-        </w:rPr>
-        <w:t xml:space="preserve">pecvd-fluent-mcp"</w:t>
-      </w:r>
-      <w:r>
-        <w:br/>
-      </w:r>
-      <w:r>
-        <w:rPr>
-          <w:rStyle w:val="NormalTok"/>
-        </w:rPr>
-        <w:t xml:space="preserve">      </w:t>
-      </w:r>
-      <w:r>
-        <w:rPr>
-          <w:rStyle w:val="FunctionTok"/>
-        </w:rPr>
-        <w:t xml:space="preserve">}</w:t>
-      </w:r>
-      <w:r>
-        <w:br/>
-      </w:r>
-      <w:r>
-        <w:rPr>
-          <w:rStyle w:val="NormalTok"/>
-        </w:rPr>
-        <w:t xml:space="preserve">    </w:t>
-      </w:r>
-      <w:r>
-        <w:rPr>
-          <w:rStyle w:val="FunctionTok"/>
-        </w:rPr>
-        <w:t xml:space="preserve">}</w:t>
-      </w:r>
-      <w:r>
-        <w:br/>
-      </w:r>
-      <w:r>
-        <w:rPr>
-          <w:rStyle w:val="NormalTok"/>
-        </w:rPr>
-        <w:t xml:space="preserve">  </w:t>
-      </w:r>
-      <w:r>
-        <w:rPr>
-          <w:rStyle w:val="FunctionTok"/>
-        </w:rPr>
-        <w:t xml:space="preserve">}</w:t>
-      </w:r>
-      <w:r>
-        <w:br/>
-      </w:r>
-      <w:r>
-        <w:rPr>
-          <w:rStyle w:val="FunctionTok"/>
-        </w:rPr>
-        <w:t xml:space="preserve">}</w:t>
+        <w:t xml:space="preserve">若项目名已存在，换新名，例如</w:t>
+      </w:r>
+      <w:r>
+        <w:t xml:space="preserve"> </w:t>
+      </w:r>
+      <w:r>
+        <w:rPr>
+          <w:rStyle w:val="VerbatimChar"/>
+        </w:rPr>
+        <w:t xml:space="preserve">first_check_02</w:t>
+      </w:r>
+      <w:r>
+        <w:t xml:space="preserve">。需要修改本包源码时，先结束 MCP 和其管理的 Fluent，再修改、重启。移动整个工程后重新运行安装以更新路径。</w:t>
+      </w:r>
+    </w:p>
+    <w:bookmarkEnd w:id="31"/>
+    <w:bookmarkStart w:id="32" w:name="四连接测试到底算了什么"/>
+    <w:p>
+      <w:pPr>
+        <w:pStyle w:val="Heading2"/>
+      </w:pPr>
+      <w:r>
+        <w:t xml:space="preserve">四、连接测试到底算了什么</w:t>
       </w:r>
     </w:p>
     <w:p>
@@ -1207,26 +1539,178 @@
         <w:pStyle w:val="FirstParagraph"/>
       </w:pPr>
       <w:r>
-        <w:rPr>
-          <w:rStyle w:val="VerbatimChar"/>
-        </w:rPr>
-        <w:t xml:space="preserve">Start_MCP.cmd</w:t>
-      </w:r>
-      <w:r>
-        <w:t xml:space="preserve"> </w:t>
-      </w:r>
-      <w:r>
-        <w:t xml:space="preserve">是另一种启动入口，供支持命令脚本的客户端使用；双击后等待输入是正常的，它不是带按钮的应用程序。MCP 本包只用 STDIO，不需要公网 IP、开放端口或远程桌面密码。</w:t>
-      </w:r>
-    </w:p>
-    <w:bookmarkEnd w:id="26"/>
-    <w:bookmarkStart w:id="27" w:name="三连接后的第一条指令"/>
+        <w:t xml:space="preserve">已实现的几何是</w:t>
+      </w:r>
+      <w:r>
+        <w:t xml:space="preserve"> </w:t>
+      </w:r>
+      <w:r>
+        <w:rPr>
+          <w:rStyle w:val="VerbatimChar"/>
+        </w:rPr>
+        <w:t xml:space="preserve">r=0–165 mm, z=0–15 mm</w:t>
+      </w:r>
+      <w:r>
+        <w:t xml:space="preserve"> </w:t>
+      </w:r>
+      <w:r>
+        <w:t xml:space="preserve">的轴对称极板间隙，晶圆边界为</w:t>
+      </w:r>
+      <w:r>
+        <w:t xml:space="preserve"> </w:t>
+      </w:r>
+      <w:r>
+        <w:rPr>
+          <w:rStyle w:val="VerbatimChar"/>
+        </w:rPr>
+        <w:t xml:space="preserve">r=0–150 mm</w:t>
+      </w:r>
+      <w:r>
+        <w:t xml:space="preserve">；Fluent 坐标</w:t>
+      </w:r>
+      <w:r>
+        <w:t xml:space="preserve"> </w:t>
+      </w:r>
+      <w:r>
+        <w:rPr>
+          <w:rStyle w:val="VerbatimChar"/>
+        </w:rPr>
+        <w:t xml:space="preserve">x=z</w:t>
+      </w:r>
+      <w:r>
+        <w:t xml:space="preserve">、</w:t>
+      </w:r>
+      <w:r>
+        <w:rPr>
+          <w:rStyle w:val="VerbatimChar"/>
+        </w:rPr>
+        <w:t xml:space="preserve">y=r</w:t>
+      </w:r>
+      <w:r>
+        <w:t xml:space="preserve">，单位为米。默认 132×24 四边形单元。包括晶圆、边缘环、轴线、上部等效入口和侧出口。</w:t>
+      </w:r>
+    </w:p>
+    <w:p>
+      <w:pPr>
+        <w:pStyle w:val="BodyText"/>
+      </w:pPr>
+      <w:r>
+        <w:t xml:space="preserve">可选</w:t>
+      </w:r>
+      <w:r>
+        <w:t xml:space="preserve"> </w:t>
+      </w:r>
+      <w:r>
+        <w:rPr>
+          <w:rStyle w:val="VerbatimChar"/>
+        </w:rPr>
+        <w:t xml:space="preserve">baseline</w:t>
+      </w:r>
+      <w:r>
+        <w:t xml:space="preserve">（全开）、</w:t>
+      </w:r>
+      <w:r>
+        <w:rPr>
+          <w:rStyle w:val="VerbatimChar"/>
+        </w:rPr>
+        <w:t xml:space="preserve">center_open</w:t>
+      </w:r>
+      <w:r>
+        <w:t xml:space="preserve">（r&lt;75 mm 开）、</w:t>
+      </w:r>
+      <w:r>
+        <w:rPr>
+          <w:rStyle w:val="VerbatimChar"/>
+        </w:rPr>
+        <w:t xml:space="preserve">edge_open</w:t>
+      </w:r>
+      <w:r>
+        <w:t xml:space="preserve">（r&gt;75 mm 开）。它们是图 2 开孔区域的等效入口</w:t>
+      </w:r>
+      <w:r>
+        <w:rPr>
+          <w:b/>
+          <w:bCs/>
+        </w:rPr>
+        <w:t xml:space="preserve">连接测试</w:t>
+      </w:r>
+      <w:r>
+        <w:t xml:space="preserve">，没有匀流腔、孔道和多孔阻力，不能用它们代替论文完整反应器并声称复现图 4。</w:t>
+      </w:r>
+    </w:p>
+    <w:p>
+      <w:pPr>
+        <w:pStyle w:val="BodyText"/>
+      </w:pPr>
+      <w:r>
+        <w:t xml:space="preserve">设置采用单一中性理想气体替代物、层流和传热，按 SiH₄/NH₃ 比例换算平均分子量。黏度</w:t>
+      </w:r>
+      <w:r>
+        <w:t xml:space="preserve"> </w:t>
+      </w:r>
+      <w:r>
+        <w:rPr>
+          <w:rStyle w:val="VerbatimChar"/>
+        </w:rPr>
+        <w:t xml:space="preserve">1.2e-5 Pa·s</w:t>
+      </w:r>
+      <w:r>
+        <w:t xml:space="preserve">、比热</w:t>
+      </w:r>
+      <w:r>
+        <w:t xml:space="preserve"> </w:t>
+      </w:r>
+      <w:r>
+        <w:rPr>
+          <w:rStyle w:val="VerbatimChar"/>
+        </w:rPr>
+        <w:t xml:space="preserve">2000 J/(kg·K)</w:t>
+      </w:r>
+      <w:r>
+        <w:t xml:space="preserve">、导热系数</w:t>
+      </w:r>
+      <w:r>
+        <w:t xml:space="preserve"> </w:t>
+      </w:r>
+      <w:r>
+        <w:rPr>
+          <w:rStyle w:val="VerbatimChar"/>
+        </w:rPr>
+        <w:t xml:space="preserve">0.04 W/(m·K)</w:t>
+      </w:r>
+      <w:r>
+        <w:t xml:space="preserve"> </w:t>
+      </w:r>
+      <w:r>
+        <w:t xml:space="preserve">是明确标注的数值测试假设，</w:t>
+      </w:r>
+      <w:r>
+        <w:rPr>
+          <w:b/>
+          <w:bCs/>
+        </w:rPr>
+        <w:t xml:space="preserve">不是已核实的 SiH₄/NH₃ 物性</w:t>
+      </w:r>
+      <w:r>
+        <w:t xml:space="preserve">。不启用电子、离子、多组分化学反应或表面沉积。</w:t>
+      </w:r>
+    </w:p>
+    <w:p>
+      <w:pPr>
+        <w:pStyle w:val="BodyText"/>
+      </w:pPr>
+      <w:r>
+        <w:t xml:space="preserve">因此该测试用于确认“客户端 → MCP → PyFluent → Fluent → 网格/设置/迭代/真实 case 文件”整条链路可用。开发云环境没有 ANSYS 安装和许可，原生网格检查、Windows GUI 启动及设置赋值仍需在你电脑上实际验收。</w:t>
+      </w:r>
+    </w:p>
+    <w:bookmarkEnd w:id="32"/>
+    <w:bookmarkStart w:id="33" w:name="五论文基准和真正的研究模型"/>
     <w:p>
       <w:pPr>
         <w:pStyle w:val="Heading2"/>
       </w:pPr>
       <w:r>
-        <w:t xml:space="preserve">三、连接后的第一条指令</w:t>
+        <w:t xml:space="preserve">五、论文基准和真正的研究模型</w:t>
       </w:r>
     </w:p>
     <w:p>
@@ -1234,23 +1718,47 @@
         <w:pStyle w:val="FirstParagraph"/>
       </w:pPr>
       <w:r>
-        <w:t xml:space="preserve">把下面这段发给已接入 MCP 的客户端助手：</w:t>
-      </w:r>
-    </w:p>
-    <w:p>
-      <w:pPr>
-        <w:pStyle w:val="BlockText"/>
-      </w:pPr>
-      <w:r>
-        <w:t xml:space="preserve">使用 pecvd-fluent 工具。先 check_environment，再 read_paper_baseline。创建一个新项目 first_check_01，生成 baseline 网格，启动 Fluent 2024 R1 的二维双精度界面，载入并检查网格。读 mesh-check.trn，确认没有负体积和拓扑错误后，配置非反应连接测试，初始化，先迭代 25 步并保存 case/data。检查日志，不要把该测试称为等离子体或沉积验证，不要覆盖旧项目。</w:t>
-      </w:r>
-    </w:p>
-    <w:p>
-      <w:pPr>
-        <w:pStyle w:val="FirstParagraph"/>
-      </w:pPr>
-      <w:r>
-        <w:t xml:space="preserve">真实调用顺序：</w:t>
+        <w:t xml:space="preserve">详细工况、方程路线、待补数据和宏观—微观接口见</w:t>
+      </w:r>
+      <w:r>
+        <w:t xml:space="preserve"> </w:t>
+      </w:r>
+      <w:r>
+        <w:rPr>
+          <w:rStyle w:val="VerbatimChar"/>
+        </w:rPr>
+        <w:t xml:space="preserve">docs/建模依据与阶段任务.md</w:t>
+      </w:r>
+      <w:r>
+        <w:t xml:space="preserve">。基准数据的机器可读文件为</w:t>
+      </w:r>
+      <w:r>
+        <w:t xml:space="preserve"> </w:t>
+      </w:r>
+      <w:r>
+        <w:rPr>
+          <w:rStyle w:val="VerbatimChar"/>
+        </w:rPr>
+        <w:t xml:space="preserve">pecvd_mcp/baseline.json</w:t>
+      </w:r>
+      <w:r>
+        <w:t xml:space="preserve">，含来源页码及标准状态假设。</w:t>
+      </w:r>
+    </w:p>
+    <w:p>
+      <w:pPr>
+        <w:pStyle w:val="BodyText"/>
+      </w:pPr>
+      <w:r>
+        <w:t xml:space="preserve">完整模型还需要建立匀流腔及多孔板，并实现等离子体漂移扩散／电子能量／泊松方程、主要中性粒子反应输运、晶圆表面反应。Fluent 普通流动模块不自动提供这套低温非平衡等离子体模型，需要可靠的 UDS/UDF 或与 COMSOL Plasma 等独立模型交换数据。当前包没有实现这些方程，也没有用预设电子密度替代真实放电。</w:t>
+      </w:r>
+    </w:p>
+    <w:p>
+      <w:pPr>
+        <w:pStyle w:val="BodyText"/>
+      </w:pPr>
+      <w:r>
+        <w:t xml:space="preserve">目前已提供两个数据接口：</w:t>
       </w:r>
     </w:p>
     <w:p>
@@ -1265,10 +1773,28 @@
         <w:rPr>
           <w:rStyle w:val="VerbatimChar"/>
         </w:rPr>
-        <w:t xml:space="preserve">check_environment()</w:t>
-      </w:r>
-      <w:r>
-        <w:t xml:space="preserve">，确认版本、路径与依赖。</w:t>
+        <w:t xml:space="preserve">check_external_plasma_table</w:t>
+      </w:r>
+      <w:r>
+        <w:t xml:space="preserve"> </w:t>
+      </w:r>
+      <w:r>
+        <w:t xml:space="preserve">检查真实外部计算的</w:t>
+      </w:r>
+      <w:r>
+        <w:t xml:space="preserve"> </w:t>
+      </w:r>
+      <w:r>
+        <w:rPr>
+          <w:rStyle w:val="VerbatimChar"/>
+        </w:rPr>
+        <w:t xml:space="preserve">r_m,z_m,ne_m3,Te_eV</w:t>
+      </w:r>
+      <w:r>
+        <w:t xml:space="preserve"> </w:t>
+      </w:r>
+      <w:r>
+        <w:t xml:space="preserve">CSV，只检查格式和范围；不把数据自动插值加载进 Fluent，不代表已验证等离子体物理。</w:t>
       </w:r>
     </w:p>
     <w:p>
@@ -1283,518 +1809,27 @@
         <w:rPr>
           <w:rStyle w:val="VerbatimChar"/>
         </w:rPr>
-        <w:t xml:space="preserve">read_paper_baseline()</w:t>
-      </w:r>
-      <w:r>
-        <w:t xml:space="preserve">，读取已摘录工况和缺失项。</w:t>
-      </w:r>
-    </w:p>
-    <w:p>
-      <w:pPr>
-        <w:pStyle w:val="Compact"/>
-        <w:numPr>
-          <w:ilvl w:val="0"/>
-          <w:numId w:val="1003"/>
-        </w:numPr>
-      </w:pPr>
-      <w:r>
-        <w:rPr>
-          <w:rStyle w:val="VerbatimChar"/>
-        </w:rPr>
-        <w:t xml:space="preserve">create_connection_project("first_check_01")</w:t>
-      </w:r>
-      <w:r>
-        <w:t xml:space="preserve">，生成新网格和项目记录。</w:t>
-      </w:r>
-    </w:p>
-    <w:p>
-      <w:pPr>
-        <w:pStyle w:val="Compact"/>
-        <w:numPr>
-          <w:ilvl w:val="0"/>
-          <w:numId w:val="1003"/>
-        </w:numPr>
-      </w:pPr>
-      <w:r>
-        <w:rPr>
-          <w:rStyle w:val="VerbatimChar"/>
-        </w:rPr>
-        <w:t xml:space="preserve">launch_fluent("first_check_01")</w:t>
-      </w:r>
-      <w:r>
-        <w:t xml:space="preserve">，启动</w:t>
+        <w:t xml:space="preserve">convert_actual_wafer_flux_to_deposition</w:t>
+      </w:r>
+      <w:r>
+        <w:t xml:space="preserve"> </w:t>
+      </w:r>
+      <w:r>
+        <w:t xml:space="preserve">将</w:t>
       </w:r>
       <w:r>
         <w:rPr>
           <w:b/>
           <w:bCs/>
         </w:rPr>
-        <w:t xml:space="preserve">单独的新 Fluent 进程</w:t>
-      </w:r>
-      <w:r>
-        <w:t xml:space="preserve">，使用你的本地许可；保留你已打开的其他工程。</w:t>
-      </w:r>
-    </w:p>
-    <w:p>
-      <w:pPr>
-        <w:pStyle w:val="Compact"/>
-        <w:numPr>
-          <w:ilvl w:val="0"/>
-          <w:numId w:val="1003"/>
-        </w:numPr>
-      </w:pPr>
-      <w:r>
-        <w:rPr>
-          <w:rStyle w:val="VerbatimChar"/>
-        </w:rPr>
-        <w:t xml:space="preserve">load_and_check_gap_mesh("first_check_01")</w:t>
-      </w:r>
-      <w:r>
-        <w:t xml:space="preserve">。</w:t>
-      </w:r>
-    </w:p>
-    <w:p>
-      <w:pPr>
-        <w:pStyle w:val="Compact"/>
-        <w:numPr>
-          <w:ilvl w:val="0"/>
-          <w:numId w:val="1003"/>
-        </w:numPr>
-      </w:pPr>
-      <w:r>
-        <w:rPr>
-          <w:rStyle w:val="VerbatimChar"/>
-        </w:rPr>
-        <w:t xml:space="preserve">read_project_text("first_check_01", "mesh-check.trn")</w:t>
-      </w:r>
-      <w:r>
-        <w:t xml:space="preserve">。需要实际检查体积、拓扑和单位；有错误就停止，保留日志排查。</w:t>
-      </w:r>
-    </w:p>
-    <w:p>
-      <w:pPr>
-        <w:pStyle w:val="Compact"/>
-        <w:numPr>
-          <w:ilvl w:val="0"/>
-          <w:numId w:val="1003"/>
-        </w:numPr>
-      </w:pPr>
-      <w:r>
-        <w:t xml:space="preserve">检查通过才调用</w:t>
-      </w:r>
-      <w:r>
-        <w:t xml:space="preserve"> </w:t>
-      </w:r>
-      <w:r>
-        <w:rPr>
-          <w:rStyle w:val="VerbatimChar"/>
-        </w:rPr>
-        <w:t xml:space="preserve">configure_nonreactive_connection_test("first_check_01", true)</w:t>
-      </w:r>
-      <w:r>
-        <w:t xml:space="preserve">。</w:t>
-      </w:r>
-    </w:p>
-    <w:p>
-      <w:pPr>
-        <w:pStyle w:val="Compact"/>
-        <w:numPr>
-          <w:ilvl w:val="0"/>
-          <w:numId w:val="1003"/>
-        </w:numPr>
-      </w:pPr>
-      <w:r>
-        <w:rPr>
-          <w:rStyle w:val="VerbatimChar"/>
-        </w:rPr>
-        <w:t xml:space="preserve">initialize_connection_test("first_check_01")</w:t>
-      </w:r>
-      <w:r>
-        <w:t xml:space="preserve">。</w:t>
-      </w:r>
-    </w:p>
-    <w:p>
-      <w:pPr>
-        <w:pStyle w:val="Compact"/>
-        <w:numPr>
-          <w:ilvl w:val="0"/>
-          <w:numId w:val="1003"/>
-        </w:numPr>
-      </w:pPr>
-      <w:r>
-        <w:rPr>
-          <w:rStyle w:val="VerbatimChar"/>
-        </w:rPr>
-        <w:t xml:space="preserve">iterate_connection_test("first_check_01", 25)</w:t>
-      </w:r>
-      <w:r>
-        <w:t xml:space="preserve">，读取返回的迭代日志。</w:t>
-      </w:r>
-    </w:p>
-    <w:p>
-      <w:pPr>
-        <w:pStyle w:val="Compact"/>
-        <w:numPr>
-          <w:ilvl w:val="0"/>
-          <w:numId w:val="1003"/>
-        </w:numPr>
-      </w:pPr>
-      <w:r>
-        <w:rPr>
-          <w:rStyle w:val="VerbatimChar"/>
-        </w:rPr>
-        <w:t xml:space="preserve">save_case_and_data("first_check_01")</w:t>
-      </w:r>
-      <w:r>
-        <w:t xml:space="preserve">，再关闭</w:t>
-      </w:r>
-      <w:r>
-        <w:t xml:space="preserve"> </w:t>
-      </w:r>
-      <w:r>
-        <w:rPr>
-          <w:rStyle w:val="VerbatimChar"/>
-        </w:rPr>
-        <w:t xml:space="preserve">close_managed_fluent()</w:t>
-      </w:r>
-      <w:r>
-        <w:t xml:space="preserve">。</w:t>
-      </w:r>
-    </w:p>
-    <w:p>
-      <w:pPr>
-        <w:pStyle w:val="FirstParagraph"/>
-      </w:pPr>
-      <w:r>
-        <w:t xml:space="preserve">每次迭代最多 500 步。迭代完成只表示命令执行结束，收敛还需检查残差、进出口质量守恒和监测量。退出 MCP 客户端会结束它管理的 Fluent 会话，退出前先保存。</w:t>
-      </w:r>
-    </w:p>
-    <w:p>
-      <w:pPr>
-        <w:pStyle w:val="BodyText"/>
-      </w:pPr>
-      <w:r>
-        <w:t xml:space="preserve">若项目名已存在，换新名，例如</w:t>
-      </w:r>
-      <w:r>
-        <w:t xml:space="preserve"> </w:t>
-      </w:r>
-      <w:r>
-        <w:rPr>
-          <w:rStyle w:val="VerbatimChar"/>
-        </w:rPr>
-        <w:t xml:space="preserve">first_check_02</w:t>
-      </w:r>
-      <w:r>
-        <w:t xml:space="preserve">。需要修改本包源码时，先结束 MCP 和其管理的 Fluent，再修改、重启。移动整个工程后重新运行安装以更新路径。</w:t>
-      </w:r>
-    </w:p>
-    <w:bookmarkEnd w:id="27"/>
-    <w:bookmarkStart w:id="28" w:name="四连接测试到底算了什么"/>
-    <w:p>
-      <w:pPr>
-        <w:pStyle w:val="Heading2"/>
-      </w:pPr>
-      <w:r>
-        <w:t xml:space="preserve">四、连接测试到底算了什么</w:t>
-      </w:r>
-    </w:p>
-    <w:p>
-      <w:pPr>
-        <w:pStyle w:val="FirstParagraph"/>
-      </w:pPr>
-      <w:r>
-        <w:t xml:space="preserve">已实现的几何是</w:t>
-      </w:r>
-      <w:r>
-        <w:t xml:space="preserve"> </w:t>
-      </w:r>
-      <w:r>
-        <w:rPr>
-          <w:rStyle w:val="VerbatimChar"/>
-        </w:rPr>
-        <w:t xml:space="preserve">r=0–165 mm, z=0–15 mm</w:t>
-      </w:r>
-      <w:r>
-        <w:t xml:space="preserve"> </w:t>
-      </w:r>
-      <w:r>
-        <w:t xml:space="preserve">的轴对称极板间隙，晶圆边界为</w:t>
-      </w:r>
-      <w:r>
-        <w:t xml:space="preserve"> </w:t>
-      </w:r>
-      <w:r>
-        <w:rPr>
-          <w:rStyle w:val="VerbatimChar"/>
-        </w:rPr>
-        <w:t xml:space="preserve">r=0–150 mm</w:t>
-      </w:r>
-      <w:r>
-        <w:t xml:space="preserve">；Fluent 坐标</w:t>
-      </w:r>
-      <w:r>
-        <w:t xml:space="preserve"> </w:t>
-      </w:r>
-      <w:r>
-        <w:rPr>
-          <w:rStyle w:val="VerbatimChar"/>
-        </w:rPr>
-        <w:t xml:space="preserve">x=z</w:t>
-      </w:r>
-      <w:r>
-        <w:t xml:space="preserve">、</w:t>
-      </w:r>
-      <w:r>
-        <w:rPr>
-          <w:rStyle w:val="VerbatimChar"/>
-        </w:rPr>
-        <w:t xml:space="preserve">y=r</w:t>
-      </w:r>
-      <w:r>
-        <w:t xml:space="preserve">，单位为米。默认 132×24 四边形单元。包括晶圆、边缘环、轴线、上部等效入口和侧出口。</w:t>
-      </w:r>
-    </w:p>
-    <w:p>
-      <w:pPr>
-        <w:pStyle w:val="BodyText"/>
-      </w:pPr>
-      <w:r>
-        <w:t xml:space="preserve">可选</w:t>
-      </w:r>
-      <w:r>
-        <w:t xml:space="preserve"> </w:t>
-      </w:r>
-      <w:r>
-        <w:rPr>
-          <w:rStyle w:val="VerbatimChar"/>
-        </w:rPr>
-        <w:t xml:space="preserve">baseline</w:t>
-      </w:r>
-      <w:r>
-        <w:t xml:space="preserve">（全开）、</w:t>
-      </w:r>
-      <w:r>
-        <w:rPr>
-          <w:rStyle w:val="VerbatimChar"/>
-        </w:rPr>
-        <w:t xml:space="preserve">center_open</w:t>
-      </w:r>
-      <w:r>
-        <w:t xml:space="preserve">（r&lt;75 mm 开）、</w:t>
-      </w:r>
-      <w:r>
-        <w:rPr>
-          <w:rStyle w:val="VerbatimChar"/>
-        </w:rPr>
-        <w:t xml:space="preserve">edge_open</w:t>
-      </w:r>
-      <w:r>
-        <w:t xml:space="preserve">（r&gt;75 mm 开）。它们是图 2 开孔区域的等效入口</w:t>
-      </w:r>
-      <w:r>
-        <w:rPr>
-          <w:b/>
-          <w:bCs/>
-        </w:rPr>
-        <w:t xml:space="preserve">连接测试</w:t>
-      </w:r>
-      <w:r>
-        <w:t xml:space="preserve">，没有匀流腔、孔道和多孔阻力，不能用它们代替论文完整反应器并声称复现图 4。</w:t>
-      </w:r>
-    </w:p>
-    <w:p>
-      <w:pPr>
-        <w:pStyle w:val="BodyText"/>
-      </w:pPr>
-      <w:r>
-        <w:t xml:space="preserve">设置采用单一中性理想气体替代物、层流和传热，按 SiH₄/NH₃ 比例换算平均分子量。黏度</w:t>
-      </w:r>
-      <w:r>
-        <w:t xml:space="preserve"> </w:t>
-      </w:r>
-      <w:r>
-        <w:rPr>
-          <w:rStyle w:val="VerbatimChar"/>
-        </w:rPr>
-        <w:t xml:space="preserve">1.2e-5 Pa·s</w:t>
-      </w:r>
-      <w:r>
-        <w:t xml:space="preserve">、比热</w:t>
-      </w:r>
-      <w:r>
-        <w:t xml:space="preserve"> </w:t>
-      </w:r>
-      <w:r>
-        <w:rPr>
-          <w:rStyle w:val="VerbatimChar"/>
-        </w:rPr>
-        <w:t xml:space="preserve">2000 J/(kg·K)</w:t>
-      </w:r>
-      <w:r>
-        <w:t xml:space="preserve">、导热系数</w:t>
-      </w:r>
-      <w:r>
-        <w:t xml:space="preserve"> </w:t>
-      </w:r>
-      <w:r>
-        <w:rPr>
-          <w:rStyle w:val="VerbatimChar"/>
-        </w:rPr>
-        <w:t xml:space="preserve">0.04 W/(m·K)</w:t>
-      </w:r>
-      <w:r>
-        <w:t xml:space="preserve"> </w:t>
-      </w:r>
-      <w:r>
-        <w:t xml:space="preserve">是明确标注的数值测试假设，</w:t>
-      </w:r>
-      <w:r>
-        <w:rPr>
-          <w:b/>
-          <w:bCs/>
-        </w:rPr>
-        <w:t xml:space="preserve">不是已核实的 SiH₄/NH₃ 物性</w:t>
-      </w:r>
-      <w:r>
-        <w:t xml:space="preserve">。不启用电子、离子、多组分化学反应或表面沉积。</w:t>
-      </w:r>
-    </w:p>
-    <w:p>
-      <w:pPr>
-        <w:pStyle w:val="BodyText"/>
-      </w:pPr>
-      <w:r>
-        <w:t xml:space="preserve">因此该测试用于确认“客户端 → MCP → PyFluent → Fluent → 网格/设置/迭代/真实 case 文件”整条链路可用。开发云环境没有 ANSYS 安装和许可，原生网格检查、Windows GUI 启动及设置赋值仍需在你电脑上实际验收。</w:t>
-      </w:r>
-    </w:p>
-    <w:bookmarkEnd w:id="28"/>
-    <w:bookmarkStart w:id="29" w:name="五论文基准和真正的研究模型"/>
-    <w:p>
-      <w:pPr>
-        <w:pStyle w:val="Heading2"/>
-      </w:pPr>
-      <w:r>
-        <w:t xml:space="preserve">五、论文基准和真正的研究模型</w:t>
-      </w:r>
-    </w:p>
-    <w:p>
-      <w:pPr>
-        <w:pStyle w:val="FirstParagraph"/>
-      </w:pPr>
-      <w:r>
-        <w:t xml:space="preserve">详细工况、方程路线、待补数据和宏观—微观接口见</w:t>
-      </w:r>
-      <w:r>
-        <w:t xml:space="preserve"> </w:t>
-      </w:r>
-      <w:r>
-        <w:rPr>
-          <w:rStyle w:val="VerbatimChar"/>
-        </w:rPr>
-        <w:t xml:space="preserve">docs/建模依据与阶段任务.md</w:t>
-      </w:r>
-      <w:r>
-        <w:t xml:space="preserve">。基准数据的机器可读文件为</w:t>
-      </w:r>
-      <w:r>
-        <w:t xml:space="preserve"> </w:t>
-      </w:r>
-      <w:r>
-        <w:rPr>
-          <w:rStyle w:val="VerbatimChar"/>
-        </w:rPr>
-        <w:t xml:space="preserve">pecvd_mcp/baseline.json</w:t>
-      </w:r>
-      <w:r>
-        <w:t xml:space="preserve">，含来源页码及标准状态假设。</w:t>
-      </w:r>
-    </w:p>
-    <w:p>
-      <w:pPr>
-        <w:pStyle w:val="BodyText"/>
-      </w:pPr>
-      <w:r>
-        <w:t xml:space="preserve">完整模型还需要建立匀流腔及多孔板，并实现等离子体漂移扩散／电子能量／泊松方程、主要中性粒子反应输运、晶圆表面反应。Fluent 普通流动模块不自动提供这套低温非平衡等离子体模型，需要可靠的 UDS/UDF 或与 COMSOL Plasma 等独立模型交换数据。当前包没有实现这些方程，也没有用预设电子密度替代真实放电。</w:t>
-      </w:r>
-    </w:p>
-    <w:p>
-      <w:pPr>
-        <w:pStyle w:val="BodyText"/>
-      </w:pPr>
-      <w:r>
-        <w:t xml:space="preserve">目前已提供两个数据接口：</w:t>
-      </w:r>
-    </w:p>
-    <w:p>
-      <w:pPr>
-        <w:pStyle w:val="Compact"/>
-        <w:numPr>
-          <w:ilvl w:val="0"/>
-          <w:numId w:val="1004"/>
-        </w:numPr>
-      </w:pPr>
-      <w:r>
-        <w:rPr>
-          <w:rStyle w:val="VerbatimChar"/>
-        </w:rPr>
-        <w:t xml:space="preserve">check_external_plasma_table</w:t>
-      </w:r>
-      <w:r>
-        <w:t xml:space="preserve"> </w:t>
-      </w:r>
-      <w:r>
-        <w:t xml:space="preserve">检查真实外部计算的</w:t>
-      </w:r>
-      <w:r>
-        <w:t xml:space="preserve"> </w:t>
-      </w:r>
-      <w:r>
-        <w:rPr>
-          <w:rStyle w:val="VerbatimChar"/>
-        </w:rPr>
-        <w:t xml:space="preserve">r_m,z_m,ne_m3,Te_eV</w:t>
-      </w:r>
-      <w:r>
-        <w:t xml:space="preserve"> </w:t>
-      </w:r>
-      <w:r>
-        <w:t xml:space="preserve">CSV，只检查格式和范围；不把数据自动插值加载进 Fluent，不代表已验证等离子体物理。</w:t>
-      </w:r>
-    </w:p>
-    <w:p>
-      <w:pPr>
-        <w:pStyle w:val="Compact"/>
-        <w:numPr>
-          <w:ilvl w:val="0"/>
-          <w:numId w:val="1004"/>
-        </w:numPr>
-      </w:pPr>
-      <w:r>
-        <w:rPr>
-          <w:rStyle w:val="VerbatimChar"/>
-        </w:rPr>
-        <w:t xml:space="preserve">convert_actual_wafer_flux_to_deposition</w:t>
-      </w:r>
-      <w:r>
-        <w:t xml:space="preserve"> </w:t>
-      </w:r>
-      <w:r>
-        <w:t xml:space="preserve">将</w:t>
-      </w:r>
-      <w:r>
-        <w:rPr>
-          <w:b/>
-          <w:bCs/>
-        </w:rPr>
         <w:t xml:space="preserve">实际净入膜质量通量</w:t>
       </w:r>
       <w:r>
         <w:t xml:space="preserve">转换成沉积速率。需要你提供已求得的通量、薄膜密度和来源说明；不根据入口流量凭空估算沉积。</w:t>
       </w:r>
     </w:p>
-    <w:bookmarkEnd w:id="29"/>
-    <w:bookmarkStart w:id="30" w:name="六输出文件在哪里"/>
+    <w:bookmarkEnd w:id="33"/>
+    <w:bookmarkStart w:id="34" w:name="六输出文件在哪里"/>
     <w:p>
       <w:pPr>
         <w:pStyle w:val="Heading2"/>
@@ -2233,8 +2268,8 @@
         <w:t xml:space="preserve">。净入膜质量通量不同于任意一种自由基的到壁通量，也不同于包含 H₂ 等副产物的总气相通量。速率换算单位为 nm/min 和 Å/min；论文图 4 使用 Å/min。</w:t>
       </w:r>
     </w:p>
-    <w:bookmarkEnd w:id="30"/>
-    <w:bookmarkStart w:id="31" w:name="七常见问题"/>
+    <w:bookmarkEnd w:id="34"/>
+    <w:bookmarkStart w:id="35" w:name="七常见问题"/>
     <w:p>
       <w:pPr>
         <w:pStyle w:val="Heading2"/>
@@ -2574,8 +2609,8 @@
         <w:t xml:space="preserve">；本包没有自动每半个月发送汇报的任务，需要在获得阶段工程和日志后更新报告。</w:t>
       </w:r>
     </w:p>
-    <w:bookmarkEnd w:id="31"/>
-    <w:bookmarkEnd w:id="32"/>
+    <w:bookmarkEnd w:id="35"/>
+    <w:bookmarkEnd w:id="36"/>
     <w:sectPr/>
   </w:body>
 </w:document>
@@ -2877,9 +2912,6 @@
     </w:lvlOverride>
   </w:num>
   <w:num w:numId="1002">
-    <w:abstractNumId w:val="991"/>
-  </w:num>
-  <w:num w:numId="1003">
     <w:abstractNumId w:val="99411"/>
     <w:lvlOverride w:ilvl="0">
       <w:startOverride w:val="1"/>
@@ -2909,7 +2941,7 @@
       <w:startOverride w:val="1"/>
     </w:lvlOverride>
   </w:num>
-  <w:num w:numId="1004">
+  <w:num w:numId="1003">
     <w:abstractNumId w:val="991"/>
   </w:num>
 </w:numbering>

</xml_diff>